<commit_message>
pici frissítés a specifikációban
</commit_message>
<xml_diff>
--- a/doc/specifikacio/very_special_document_updated.docx
+++ b/doc/specifikacio/very_special_document_updated.docx
@@ -1901,7 +1901,47 @@
         <w:rPr>
           <w:rFonts w:ascii="Times New Roman" w:hAnsi="Times New Roman" w:cs="Times New Roman"/>
         </w:rPr>
-        <w:t xml:space="preserve">) adatai a következők: </w:t>
+        <w:t>) adatai a következők:</w:t>
+      </w:r>
+      <w:r>
+        <w:rPr>
+          <w:rFonts w:ascii="Times New Roman" w:hAnsi="Times New Roman" w:cs="Times New Roman"/>
+        </w:rPr>
+        <w:t xml:space="preserve"> </w:t>
+      </w:r>
+      <w:proofErr w:type="spellStart"/>
+      <w:r>
+        <w:rPr>
+          <w:rFonts w:ascii="Times New Roman" w:hAnsi="Times New Roman" w:cs="Times New Roman"/>
+        </w:rPr>
+        <w:t>u_id</w:t>
+      </w:r>
+      <w:proofErr w:type="spellEnd"/>
+      <w:r>
+        <w:rPr>
+          <w:rFonts w:ascii="Times New Roman" w:hAnsi="Times New Roman" w:cs="Times New Roman"/>
+        </w:rPr>
+        <w:t xml:space="preserve"> (</w:t>
+      </w:r>
+      <w:proofErr w:type="spellStart"/>
+      <w:r>
+        <w:rPr>
+          <w:rFonts w:ascii="Times New Roman" w:hAnsi="Times New Roman" w:cs="Times New Roman"/>
+        </w:rPr>
+        <w:t>number</w:t>
+      </w:r>
+      <w:proofErr w:type="spellEnd"/>
+      <w:r>
+        <w:rPr>
+          <w:rFonts w:ascii="Times New Roman" w:hAnsi="Times New Roman" w:cs="Times New Roman"/>
+        </w:rPr>
+        <w:t>),</w:t>
+      </w:r>
+      <w:r>
+        <w:rPr>
+          <w:rFonts w:ascii="Times New Roman" w:hAnsi="Times New Roman" w:cs="Times New Roman"/>
+        </w:rPr>
+        <w:t xml:space="preserve"> </w:t>
       </w:r>
       <w:proofErr w:type="spellStart"/>
       <w:r>
@@ -6372,27 +6412,6 @@
 </file>
 
 <file path=customXml/item1.xml><?xml version="1.0" encoding="utf-8"?>
-<p:properties xmlns:p="http://schemas.microsoft.com/office/2006/metadata/properties" xmlns:xsi="http://www.w3.org/2001/XMLSchema-instance" xmlns:pc="http://schemas.microsoft.com/office/infopath/2007/PartnerControls">
-  <documentManagement>
-    <lcf76f155ced4ddcb4097134ff3c332f xmlns="b813be36-7098-46e1-a45f-d44548ccfb7b">
-      <Terms xmlns="http://schemas.microsoft.com/office/infopath/2007/PartnerControls"/>
-    </lcf76f155ced4ddcb4097134ff3c332f>
-    <ReferenceId xmlns="b813be36-7098-46e1-a45f-d44548ccfb7b" xsi:nil="true"/>
-    <TaxCatchAll xmlns="580c4b0b-1ea3-4245-9264-fcffcaf8b9d1" xsi:nil="true"/>
-  </documentManagement>
-</p:properties>
-</file>
-
-<file path=customXml/item2.xml><?xml version="1.0" encoding="utf-8"?>
-<?mso-contentType ?>
-<FormTemplates xmlns="http://schemas.microsoft.com/sharepoint/v3/contenttype/forms">
-  <Display>DocumentLibraryForm</Display>
-  <Edit>DocumentLibraryForm</Edit>
-  <New>DocumentLibraryForm</New>
-</FormTemplates>
-</file>
-
-<file path=customXml/item3.xml><?xml version="1.0" encoding="utf-8"?>
 <ct:contentTypeSchema xmlns:ct="http://schemas.microsoft.com/office/2006/metadata/contentType" xmlns:ma="http://schemas.microsoft.com/office/2006/metadata/properties/metaAttributes" ct:_="" ma:_="" ma:contentTypeName="Dokumentum" ma:contentTypeID="0x0101002BD20AEEB1646E438825E227F8977EEC" ma:contentTypeVersion="11" ma:contentTypeDescription="Új dokumentum létrehozása." ma:contentTypeScope="" ma:versionID="78b8323b9fadf02b52ab9645d284f236">
   <xsd:schema xmlns:xsd="http://www.w3.org/2001/XMLSchema" xmlns:xs="http://www.w3.org/2001/XMLSchema" xmlns:p="http://schemas.microsoft.com/office/2006/metadata/properties" xmlns:ns2="b813be36-7098-46e1-a45f-d44548ccfb7b" xmlns:ns3="580c4b0b-1ea3-4245-9264-fcffcaf8b9d1" targetNamespace="http://schemas.microsoft.com/office/2006/metadata/properties" ma:root="true" ma:fieldsID="9db80642e6642ec03032f59f2181700e" ns2:_="" ns3:_="">
     <xsd:import namespace="b813be36-7098-46e1-a45f-d44548ccfb7b"/>
@@ -6587,26 +6606,28 @@
 </ct:contentTypeSchema>
 </file>
 
-<file path=customXml/itemProps1.xml><?xml version="1.0" encoding="utf-8"?>
-<ds:datastoreItem xmlns:ds="http://schemas.openxmlformats.org/officeDocument/2006/customXml" ds:itemID="{DCC587E8-30E5-46F6-961B-1DE67CC9752E}">
-  <ds:schemaRefs>
-    <ds:schemaRef ds:uri="http://schemas.microsoft.com/office/2006/metadata/properties"/>
-    <ds:schemaRef ds:uri="http://schemas.microsoft.com/office/infopath/2007/PartnerControls"/>
-    <ds:schemaRef ds:uri="b813be36-7098-46e1-a45f-d44548ccfb7b"/>
-    <ds:schemaRef ds:uri="580c4b0b-1ea3-4245-9264-fcffcaf8b9d1"/>
-  </ds:schemaRefs>
-</ds:datastoreItem>
+<file path=customXml/item2.xml><?xml version="1.0" encoding="utf-8"?>
+<?mso-contentType ?>
+<FormTemplates xmlns="http://schemas.microsoft.com/sharepoint/v3/contenttype/forms">
+  <Display>DocumentLibraryForm</Display>
+  <Edit>DocumentLibraryForm</Edit>
+  <New>DocumentLibraryForm</New>
+</FormTemplates>
 </file>
 
-<file path=customXml/itemProps2.xml><?xml version="1.0" encoding="utf-8"?>
-<ds:datastoreItem xmlns:ds="http://schemas.openxmlformats.org/officeDocument/2006/customXml" ds:itemID="{BBED4DF0-F69F-4FFB-8A78-DC3E17A57387}">
-  <ds:schemaRefs>
-    <ds:schemaRef ds:uri="http://schemas.microsoft.com/sharepoint/v3/contenttype/forms"/>
-  </ds:schemaRefs>
-</ds:datastoreItem>
+<file path=customXml/item3.xml><?xml version="1.0" encoding="utf-8"?>
+<p:properties xmlns:p="http://schemas.microsoft.com/office/2006/metadata/properties" xmlns:xsi="http://www.w3.org/2001/XMLSchema-instance" xmlns:pc="http://schemas.microsoft.com/office/infopath/2007/PartnerControls">
+  <documentManagement>
+    <lcf76f155ced4ddcb4097134ff3c332f xmlns="b813be36-7098-46e1-a45f-d44548ccfb7b">
+      <Terms xmlns="http://schemas.microsoft.com/office/infopath/2007/PartnerControls"/>
+    </lcf76f155ced4ddcb4097134ff3c332f>
+    <ReferenceId xmlns="b813be36-7098-46e1-a45f-d44548ccfb7b" xsi:nil="true"/>
+    <TaxCatchAll xmlns="580c4b0b-1ea3-4245-9264-fcffcaf8b9d1" xsi:nil="true"/>
+  </documentManagement>
+</p:properties>
 </file>
 
-<file path=customXml/itemProps3.xml><?xml version="1.0" encoding="utf-8"?>
+<file path=customXml/itemProps1.xml><?xml version="1.0" encoding="utf-8"?>
 <ds:datastoreItem xmlns:ds="http://schemas.openxmlformats.org/officeDocument/2006/customXml" ds:itemID="{19E39873-D575-4CBB-9E1B-5FD3AFE4489E}">
   <ds:schemaRefs>
     <ds:schemaRef ds:uri="http://schemas.microsoft.com/office/2006/metadata/contentType"/>
@@ -6623,4 +6644,23 @@
     <ds:schemaRef ds:uri="http://schemas.microsoft.com/internal/obd"/>
   </ds:schemaRefs>
 </ds:datastoreItem>
+</file>
+
+<file path=customXml/itemProps2.xml><?xml version="1.0" encoding="utf-8"?>
+<ds:datastoreItem xmlns:ds="http://schemas.openxmlformats.org/officeDocument/2006/customXml" ds:itemID="{BBED4DF0-F69F-4FFB-8A78-DC3E17A57387}">
+  <ds:schemaRefs>
+    <ds:schemaRef ds:uri="http://schemas.microsoft.com/sharepoint/v3/contenttype/forms"/>
+  </ds:schemaRefs>
+</ds:datastoreItem>
+</file>
+
+<file path=customXml/itemProps3.xml><?xml version="1.0" encoding="utf-8"?>
+<ds:datastoreItem xmlns:ds="http://schemas.openxmlformats.org/officeDocument/2006/customXml" ds:itemID="{DCC587E8-30E5-46F6-961B-1DE67CC9752E}">
+  <ds:schemaRefs>
+    <ds:schemaRef ds:uri="http://schemas.microsoft.com/office/2006/metadata/properties"/>
+    <ds:schemaRef ds:uri="http://schemas.microsoft.com/office/infopath/2007/PartnerControls"/>
+    <ds:schemaRef ds:uri="b813be36-7098-46e1-a45f-d44548ccfb7b"/>
+    <ds:schemaRef ds:uri="580c4b0b-1ea3-4245-9264-fcffcaf8b9d1"/>
+  </ds:schemaRefs>
+</ds:datastoreItem>
 </file>
</xml_diff>